<commit_message>
add description knowledge base upload
</commit_message>
<xml_diff>
--- a/data/biaya dan tentang kami.docx
+++ b/data/biaya dan tentang kami.docx
@@ -14,8 +14,32 @@
       </w:r>
     </w:p>
     <w:p>
-      <w:r>
-        <w:t xml:space="preserve">Pendaftaran Rp. 300,000,- </w:t>
+      <w:pPr>
+        <w:pStyle w:val="Judul2"/>
+      </w:pPr>
+      <w:r>
+        <w:rPr>
+          <w:rStyle w:val="Judul2KAR"/>
+        </w:rPr>
+        <w:t>Pendaftaran</w:t>
+      </w:r>
+      <w:r>
+        <w:t xml:space="preserve"> </w:t>
+      </w:r>
+    </w:p>
+    <w:p>
+      <w:pPr>
+        <w:rPr>
+          <w:b/>
+          <w:bCs/>
+        </w:rPr>
+      </w:pPr>
+      <w:r>
+        <w:rPr>
+          <w:b/>
+          <w:bCs/>
+        </w:rPr>
+        <w:t xml:space="preserve">Rp. 300,000,- </w:t>
       </w:r>
     </w:p>
     <w:p>
@@ -24,18 +48,93 @@
       </w:r>
     </w:p>
     <w:p>
-      <w:r>
-        <w:t>Rp. 6,000,000,- Investasi pendidikan yang digunakan untuk meningkatkan kualitas fasilitas, teknologi, dan lingkungan belajar yang modern dan nyaman. Pembayaran dapat dilakukan secara bertahap dan dicicil hingga 2 semester pertama. PSPT ( Pengenalan Sistem Perguruan Tinggi )</w:t>
-      </w:r>
-    </w:p>
-    <w:p>
-      <w:r>
-        <w:t xml:space="preserve"> Rp. 500,000,- Program pengenalan kampus yang membantu mahasiswa baru mengenal sistem perkuliahan, lingkungan akademik, serta membangun relasi dan pengalaman baru sejak awal perkuliahan. </w:t>
+      <w:pPr>
+        <w:pStyle w:val="Judul2"/>
+      </w:pPr>
+      <w:r>
+        <w:t>Uang Kuliah Tetap (UKT)</w:t>
+      </w:r>
+    </w:p>
+    <w:p>
+      <w:pPr>
+        <w:rPr>
+          <w:b/>
+          <w:bCs/>
+        </w:rPr>
+      </w:pPr>
+      <w:r>
+        <w:rPr>
+          <w:b/>
+          <w:bCs/>
+        </w:rPr>
+        <w:t>Rp. 5,000,000,-</w:t>
+      </w:r>
+    </w:p>
+    <w:p>
+      <w:r>
+        <w:t>Biaya per semester yang mendukung proses pembelajaran, layanan akademik, dan berbagai fasilitas penunjang pendidikan selama masa studi. Untuk memberikan kemudahan pembayaran, UKT dapat dicicil hingga 3 kali, dengan skema 40% saat pengisian KRS, 40% menjelang UTS, dan 20% menjelang UAS.</w:t>
       </w:r>
     </w:p>
     <w:p/>
     <w:p>
       <w:pPr>
+        <w:pStyle w:val="Judul2"/>
+      </w:pPr>
+      <w:r>
+        <w:t>Pengembangan Institusi</w:t>
+      </w:r>
+    </w:p>
+    <w:p>
+      <w:pPr>
+        <w:rPr>
+          <w:b/>
+          <w:bCs/>
+        </w:rPr>
+      </w:pPr>
+      <w:r>
+        <w:rPr>
+          <w:b/>
+          <w:bCs/>
+        </w:rPr>
+        <w:t xml:space="preserve">Rp. 6,000,000,- </w:t>
+      </w:r>
+    </w:p>
+    <w:p>
+      <w:r>
+        <w:t>Investasi pendidikan yang digunakan untuk meningkatkan kualitas fasilitas, teknologi, dan lingkungan belajar yang modern dan nyaman. Pembayaran dapat dilakukan secara bertahap dan dicicil hingga 2 semester pertama. PSPT ( Pengenalan Sistem Perguruan Tinggi )</w:t>
+      </w:r>
+    </w:p>
+    <w:p>
+      <w:pPr>
+        <w:pStyle w:val="Judul2"/>
+      </w:pPr>
+      <w:r>
+        <w:t>PSPT ( Pengenalan Sistem Perguruan Tinggi )</w:t>
+      </w:r>
+    </w:p>
+    <w:p>
+      <w:pPr>
+        <w:rPr>
+          <w:b/>
+          <w:bCs/>
+        </w:rPr>
+      </w:pPr>
+      <w:r>
+        <w:rPr>
+          <w:b/>
+          <w:bCs/>
+        </w:rPr>
+        <w:t xml:space="preserve"> Rp. 500,000,- </w:t>
+      </w:r>
+    </w:p>
+    <w:p>
+      <w:r>
+        <w:t xml:space="preserve">Program pengenalan kampus yang membantu mahasiswa baru mengenal sistem perkuliahan, lingkungan akademik, serta membangun relasi dan pengalaman baru sejak awal perkuliahan. </w:t>
+      </w:r>
+    </w:p>
+    <w:p/>
+    <w:p>
+      <w:pPr>
         <w:pStyle w:val="Judul1"/>
       </w:pPr>
       <w:r>
@@ -61,6 +160,10 @@
         <w:pStyle w:val="Judul1"/>
       </w:pPr>
       <w:r>
+        <w:lastRenderedPageBreak/>
+        <w:t xml:space="preserve">Tentang </w:t>
+      </w:r>
+      <w:r>
         <w:t>STMIK Bandung</w:t>
       </w:r>
       <w:r>
@@ -86,6 +189,9 @@
         <w:pStyle w:val="Judul1"/>
       </w:pPr>
       <w:r>
+        <w:t xml:space="preserve">Teknik </w:t>
+      </w:r>
+      <w:r>
         <w:t xml:space="preserve">Informatika </w:t>
       </w:r>
     </w:p>
@@ -108,693 +214,799 @@
         <w:pStyle w:val="Judul1"/>
       </w:pPr>
       <w:r>
+        <w:t>Sistem Informasi</w:t>
+      </w:r>
+    </w:p>
+    <w:p>
+      <w:r>
+        <w:t xml:space="preserve"> Program Studi Sistem Informasi STMIK Bandung memiliki cakupan yang terdiri dari pengetahuan Teknologi Informasi, Sistem Informasi, Bisnis &amp; Manajemen, Teknik dan, Cara Proses data menjadi informasi kemudian menjadi pengetahuan untuk solusi bisnis dan pengambilan keputusan, analisis dan pengembangan aplikasi serta sistem informasi, sehingga menghasilkan lulusan dengan profil analisis dan pengembangan sistem informasi dan teknologi informasi sebagai solusi.</w:t>
+      </w:r>
+    </w:p>
+    <w:p>
+      <w:pPr>
+        <w:pStyle w:val="Judul1"/>
+      </w:pPr>
+      <w:r>
+        <w:t xml:space="preserve"> </w:t>
+      </w:r>
+      <w:r>
+        <w:t>Peluang Profesi</w:t>
+      </w:r>
+    </w:p>
+    <w:p>
+      <w:pPr>
+        <w:pStyle w:val="Judul2"/>
+      </w:pPr>
+      <w:r>
+        <w:t xml:space="preserve"> Teknik Informatika</w:t>
+      </w:r>
+    </w:p>
+    <w:p>
+      <w:pPr>
+        <w:pStyle w:val="DaftarParagraf"/>
+        <w:numPr>
+          <w:ilvl w:val="0"/>
+          <w:numId w:val="1"/>
+        </w:numPr>
+      </w:pPr>
+      <w:r>
+        <w:t xml:space="preserve">IT </w:t>
+      </w:r>
+      <w:proofErr w:type="spellStart"/>
+      <w:r>
+        <w:t>Support</w:t>
+      </w:r>
+      <w:proofErr w:type="spellEnd"/>
+      <w:r>
+        <w:t xml:space="preserve"> </w:t>
+      </w:r>
+    </w:p>
+    <w:p>
+      <w:pPr>
+        <w:pStyle w:val="DaftarParagraf"/>
+        <w:numPr>
+          <w:ilvl w:val="0"/>
+          <w:numId w:val="1"/>
+        </w:numPr>
+      </w:pPr>
+      <w:r>
+        <w:t xml:space="preserve">IT </w:t>
+      </w:r>
+      <w:proofErr w:type="spellStart"/>
+      <w:r>
+        <w:t>Manager</w:t>
+      </w:r>
+      <w:proofErr w:type="spellEnd"/>
+      <w:r>
+        <w:t xml:space="preserve"> </w:t>
+      </w:r>
+    </w:p>
+    <w:p>
+      <w:pPr>
+        <w:pStyle w:val="DaftarParagraf"/>
+        <w:numPr>
+          <w:ilvl w:val="0"/>
+          <w:numId w:val="1"/>
+        </w:numPr>
+      </w:pPr>
+      <w:r>
+        <w:t xml:space="preserve">IT </w:t>
+      </w:r>
+      <w:proofErr w:type="spellStart"/>
+      <w:r>
+        <w:t>Consultant</w:t>
+      </w:r>
+      <w:proofErr w:type="spellEnd"/>
+      <w:r>
+        <w:t xml:space="preserve"> </w:t>
+      </w:r>
+    </w:p>
+    <w:p>
+      <w:pPr>
+        <w:pStyle w:val="DaftarParagraf"/>
+        <w:numPr>
+          <w:ilvl w:val="0"/>
+          <w:numId w:val="1"/>
+        </w:numPr>
+      </w:pPr>
+      <w:proofErr w:type="spellStart"/>
+      <w:r>
+        <w:t>Machine</w:t>
+      </w:r>
+      <w:proofErr w:type="spellEnd"/>
+      <w:r>
+        <w:t xml:space="preserve"> </w:t>
+      </w:r>
+      <w:proofErr w:type="spellStart"/>
+      <w:r>
+        <w:t>Learning</w:t>
+      </w:r>
+      <w:proofErr w:type="spellEnd"/>
+      <w:r>
+        <w:t xml:space="preserve"> </w:t>
+      </w:r>
+      <w:proofErr w:type="spellStart"/>
+      <w:r>
+        <w:t>Specialist</w:t>
+      </w:r>
+      <w:proofErr w:type="spellEnd"/>
+      <w:r>
+        <w:t xml:space="preserve"> </w:t>
+      </w:r>
+    </w:p>
+    <w:p>
+      <w:pPr>
+        <w:pStyle w:val="DaftarParagraf"/>
+        <w:numPr>
+          <w:ilvl w:val="0"/>
+          <w:numId w:val="1"/>
+        </w:numPr>
+      </w:pPr>
+      <w:r>
+        <w:t xml:space="preserve">Data </w:t>
+      </w:r>
+      <w:proofErr w:type="spellStart"/>
+      <w:r>
+        <w:t>Science</w:t>
+      </w:r>
+      <w:proofErr w:type="spellEnd"/>
+      <w:r>
+        <w:t xml:space="preserve"> </w:t>
+      </w:r>
+      <w:proofErr w:type="spellStart"/>
+      <w:r>
+        <w:t>Specialist</w:t>
+      </w:r>
+      <w:proofErr w:type="spellEnd"/>
+      <w:r>
+        <w:t xml:space="preserve"> </w:t>
+      </w:r>
+    </w:p>
+    <w:p>
+      <w:pPr>
+        <w:pStyle w:val="DaftarParagraf"/>
+        <w:numPr>
+          <w:ilvl w:val="0"/>
+          <w:numId w:val="1"/>
+        </w:numPr>
+      </w:pPr>
+      <w:proofErr w:type="spellStart"/>
+      <w:r>
+        <w:t>Atificial</w:t>
+      </w:r>
+      <w:proofErr w:type="spellEnd"/>
+      <w:r>
+        <w:t xml:space="preserve"> </w:t>
+      </w:r>
+      <w:proofErr w:type="spellStart"/>
+      <w:r>
+        <w:t>Intelegence</w:t>
+      </w:r>
+      <w:proofErr w:type="spellEnd"/>
+      <w:r>
+        <w:t xml:space="preserve"> </w:t>
+      </w:r>
+      <w:proofErr w:type="spellStart"/>
+      <w:r>
+        <w:t>Specialist</w:t>
+      </w:r>
+      <w:proofErr w:type="spellEnd"/>
+      <w:r>
+        <w:t xml:space="preserve"> </w:t>
+      </w:r>
+    </w:p>
+    <w:p>
+      <w:pPr>
+        <w:pStyle w:val="DaftarParagraf"/>
+        <w:numPr>
+          <w:ilvl w:val="0"/>
+          <w:numId w:val="1"/>
+        </w:numPr>
+      </w:pPr>
+      <w:proofErr w:type="spellStart"/>
+      <w:r>
+        <w:t>Software</w:t>
+      </w:r>
+      <w:proofErr w:type="spellEnd"/>
+      <w:r>
+        <w:t xml:space="preserve"> Developer </w:t>
+      </w:r>
+    </w:p>
+    <w:p>
+      <w:pPr>
+        <w:pStyle w:val="DaftarParagraf"/>
+        <w:numPr>
+          <w:ilvl w:val="0"/>
+          <w:numId w:val="1"/>
+        </w:numPr>
+      </w:pPr>
+      <w:proofErr w:type="spellStart"/>
+      <w:r>
+        <w:t>Database</w:t>
+      </w:r>
+      <w:proofErr w:type="spellEnd"/>
+      <w:r>
+        <w:t xml:space="preserve"> </w:t>
+      </w:r>
+      <w:proofErr w:type="spellStart"/>
+      <w:r>
+        <w:t>Specialist</w:t>
+      </w:r>
+      <w:proofErr w:type="spellEnd"/>
+      <w:r>
+        <w:t xml:space="preserve"> </w:t>
+      </w:r>
+    </w:p>
+    <w:p>
+      <w:pPr>
+        <w:pStyle w:val="DaftarParagraf"/>
+        <w:numPr>
+          <w:ilvl w:val="0"/>
+          <w:numId w:val="1"/>
+        </w:numPr>
+      </w:pPr>
+      <w:r>
+        <w:t xml:space="preserve">System </w:t>
+      </w:r>
+      <w:proofErr w:type="spellStart"/>
+      <w:r>
+        <w:t>Analyst</w:t>
+      </w:r>
+      <w:proofErr w:type="spellEnd"/>
+      <w:r>
+        <w:t xml:space="preserve"> </w:t>
+      </w:r>
+    </w:p>
+    <w:p>
+      <w:pPr>
+        <w:pStyle w:val="DaftarParagraf"/>
+        <w:numPr>
+          <w:ilvl w:val="0"/>
+          <w:numId w:val="1"/>
+        </w:numPr>
+      </w:pPr>
+      <w:r>
+        <w:t xml:space="preserve">Project </w:t>
+      </w:r>
+      <w:proofErr w:type="spellStart"/>
+      <w:r>
+        <w:t>Analyst</w:t>
+      </w:r>
+      <w:proofErr w:type="spellEnd"/>
+      <w:r>
+        <w:t xml:space="preserve"> </w:t>
+      </w:r>
+    </w:p>
+    <w:p>
+      <w:pPr>
+        <w:pStyle w:val="DaftarParagraf"/>
+        <w:numPr>
+          <w:ilvl w:val="0"/>
+          <w:numId w:val="1"/>
+        </w:numPr>
+      </w:pPr>
+      <w:proofErr w:type="spellStart"/>
+      <w:r>
+        <w:t>Technopreneur</w:t>
+      </w:r>
+      <w:proofErr w:type="spellEnd"/>
+      <w:r>
+        <w:t xml:space="preserve"> </w:t>
+      </w:r>
+    </w:p>
+    <w:p>
+      <w:pPr>
+        <w:pStyle w:val="DaftarParagraf"/>
+        <w:numPr>
+          <w:ilvl w:val="0"/>
+          <w:numId w:val="1"/>
+        </w:numPr>
+      </w:pPr>
+      <w:proofErr w:type="spellStart"/>
+      <w:r>
+        <w:t>Database</w:t>
+      </w:r>
+      <w:proofErr w:type="spellEnd"/>
+      <w:r>
+        <w:t xml:space="preserve"> Administrator </w:t>
+      </w:r>
+    </w:p>
+    <w:p>
+      <w:pPr>
+        <w:pStyle w:val="DaftarParagraf"/>
+        <w:numPr>
+          <w:ilvl w:val="0"/>
+          <w:numId w:val="1"/>
+        </w:numPr>
+      </w:pPr>
+      <w:proofErr w:type="spellStart"/>
+      <w:r>
         <w:lastRenderedPageBreak/>
-        <w:t>Sistem Informasi</w:t>
-      </w:r>
-    </w:p>
-    <w:p>
-      <w:r>
-        <w:t xml:space="preserve"> Program Studi Sistem Informasi STMIK Bandung memiliki cakupan yang terdiri dari pengetahuan Teknologi Informasi, Sistem Informasi, Bisnis &amp; Manajemen, Teknik dan, Cara Proses data menjadi informasi kemudian menjadi pengetahuan untuk solusi bisnis dan pengambilan keputusan, analisis dan pengembangan aplikasi serta sistem informasi, sehingga menghasilkan lulusan dengan profil analisis dan pengembangan sistem informasi dan teknologi informasi sebagai solusi.</w:t>
-      </w:r>
+        <w:t>Computer</w:t>
+      </w:r>
+      <w:proofErr w:type="spellEnd"/>
+      <w:r>
+        <w:t xml:space="preserve"> Network </w:t>
+      </w:r>
+      <w:proofErr w:type="spellStart"/>
+      <w:r>
+        <w:t>Specialist</w:t>
+      </w:r>
+      <w:proofErr w:type="spellEnd"/>
+      <w:r>
+        <w:t xml:space="preserve"> </w:t>
+      </w:r>
+    </w:p>
+    <w:p>
+      <w:pPr>
+        <w:pStyle w:val="DaftarParagraf"/>
+        <w:numPr>
+          <w:ilvl w:val="0"/>
+          <w:numId w:val="1"/>
+        </w:numPr>
+      </w:pPr>
+      <w:proofErr w:type="spellStart"/>
+      <w:r>
+        <w:t>Research</w:t>
+      </w:r>
+      <w:proofErr w:type="spellEnd"/>
+      <w:r>
+        <w:t xml:space="preserve"> </w:t>
+      </w:r>
+      <w:proofErr w:type="spellStart"/>
+      <w:r>
+        <w:t>Assistants</w:t>
+      </w:r>
+      <w:proofErr w:type="spellEnd"/>
+      <w:r>
+        <w:t xml:space="preserve"> </w:t>
+      </w:r>
+    </w:p>
+    <w:p>
+      <w:pPr>
+        <w:pStyle w:val="Judul2"/>
+      </w:pPr>
+      <w:r>
+        <w:t xml:space="preserve">Sistem Informasi </w:t>
+      </w:r>
+    </w:p>
+    <w:p>
+      <w:pPr>
+        <w:pStyle w:val="DaftarParagraf"/>
+        <w:numPr>
+          <w:ilvl w:val="0"/>
+          <w:numId w:val="2"/>
+        </w:numPr>
+      </w:pPr>
+      <w:proofErr w:type="spellStart"/>
+      <w:r>
+        <w:t>Software</w:t>
+      </w:r>
+      <w:proofErr w:type="spellEnd"/>
+      <w:r>
+        <w:t xml:space="preserve"> Developer </w:t>
+      </w:r>
+    </w:p>
+    <w:p>
+      <w:pPr>
+        <w:pStyle w:val="DaftarParagraf"/>
+        <w:numPr>
+          <w:ilvl w:val="0"/>
+          <w:numId w:val="2"/>
+        </w:numPr>
+      </w:pPr>
+      <w:proofErr w:type="spellStart"/>
+      <w:r>
+        <w:t>Database</w:t>
+      </w:r>
+      <w:proofErr w:type="spellEnd"/>
+      <w:r>
+        <w:t xml:space="preserve"> </w:t>
+      </w:r>
+      <w:proofErr w:type="spellStart"/>
+      <w:r>
+        <w:t>Designer</w:t>
+      </w:r>
+      <w:proofErr w:type="spellEnd"/>
+      <w:r>
+        <w:t xml:space="preserve"> </w:t>
+      </w:r>
+    </w:p>
+    <w:p>
+      <w:pPr>
+        <w:pStyle w:val="DaftarParagraf"/>
+        <w:numPr>
+          <w:ilvl w:val="0"/>
+          <w:numId w:val="2"/>
+        </w:numPr>
+      </w:pPr>
+      <w:proofErr w:type="spellStart"/>
+      <w:r>
+        <w:t>Machine</w:t>
+      </w:r>
+      <w:proofErr w:type="spellEnd"/>
+      <w:r>
+        <w:t xml:space="preserve"> </w:t>
+      </w:r>
+      <w:proofErr w:type="spellStart"/>
+      <w:r>
+        <w:t>Learning</w:t>
+      </w:r>
+      <w:proofErr w:type="spellEnd"/>
+      <w:r>
+        <w:t xml:space="preserve"> </w:t>
+      </w:r>
+      <w:proofErr w:type="spellStart"/>
+      <w:r>
+        <w:t>Specialist</w:t>
+      </w:r>
+      <w:proofErr w:type="spellEnd"/>
+      <w:r>
+        <w:t xml:space="preserve"> </w:t>
+      </w:r>
+    </w:p>
+    <w:p>
+      <w:pPr>
+        <w:pStyle w:val="DaftarParagraf"/>
+        <w:numPr>
+          <w:ilvl w:val="0"/>
+          <w:numId w:val="2"/>
+        </w:numPr>
+      </w:pPr>
+      <w:r>
+        <w:t xml:space="preserve">Data </w:t>
+      </w:r>
+      <w:proofErr w:type="spellStart"/>
+      <w:r>
+        <w:t>Science</w:t>
+      </w:r>
+      <w:proofErr w:type="spellEnd"/>
+      <w:r>
+        <w:t xml:space="preserve"> </w:t>
+      </w:r>
+      <w:proofErr w:type="spellStart"/>
+      <w:r>
+        <w:t>Specialist</w:t>
+      </w:r>
+      <w:proofErr w:type="spellEnd"/>
+      <w:r>
+        <w:t xml:space="preserve"> </w:t>
+      </w:r>
+    </w:p>
+    <w:p>
+      <w:pPr>
+        <w:pStyle w:val="DaftarParagraf"/>
+        <w:numPr>
+          <w:ilvl w:val="0"/>
+          <w:numId w:val="2"/>
+        </w:numPr>
+      </w:pPr>
+      <w:proofErr w:type="spellStart"/>
+      <w:r>
+        <w:t>Artificial</w:t>
+      </w:r>
+      <w:proofErr w:type="spellEnd"/>
+      <w:r>
+        <w:t xml:space="preserve"> </w:t>
+      </w:r>
+      <w:proofErr w:type="spellStart"/>
+      <w:r>
+        <w:t>Intelegence</w:t>
+      </w:r>
+      <w:proofErr w:type="spellEnd"/>
+      <w:r>
+        <w:t xml:space="preserve"> </w:t>
+      </w:r>
+      <w:proofErr w:type="spellStart"/>
+      <w:r>
+        <w:t>Specialist</w:t>
+      </w:r>
+      <w:proofErr w:type="spellEnd"/>
+      <w:r>
+        <w:t xml:space="preserve"> </w:t>
+      </w:r>
+    </w:p>
+    <w:p>
+      <w:pPr>
+        <w:pStyle w:val="DaftarParagraf"/>
+        <w:numPr>
+          <w:ilvl w:val="0"/>
+          <w:numId w:val="2"/>
+        </w:numPr>
+      </w:pPr>
+      <w:r>
+        <w:t xml:space="preserve">UI/UX </w:t>
+      </w:r>
+      <w:proofErr w:type="spellStart"/>
+      <w:r>
+        <w:t>Designer</w:t>
+      </w:r>
+      <w:proofErr w:type="spellEnd"/>
+      <w:r>
+        <w:t xml:space="preserve"> </w:t>
+      </w:r>
+    </w:p>
+    <w:p>
+      <w:pPr>
+        <w:pStyle w:val="DaftarParagraf"/>
+        <w:numPr>
+          <w:ilvl w:val="0"/>
+          <w:numId w:val="2"/>
+        </w:numPr>
+      </w:pPr>
+      <w:proofErr w:type="spellStart"/>
+      <w:r>
+        <w:t>Cloud</w:t>
+      </w:r>
+      <w:proofErr w:type="spellEnd"/>
+      <w:r>
+        <w:t xml:space="preserve"> </w:t>
+      </w:r>
+      <w:proofErr w:type="spellStart"/>
+      <w:r>
+        <w:t>Computing</w:t>
+      </w:r>
+      <w:proofErr w:type="spellEnd"/>
+      <w:r>
+        <w:t xml:space="preserve"> </w:t>
+      </w:r>
+    </w:p>
+    <w:p>
+      <w:pPr>
+        <w:pStyle w:val="DaftarParagraf"/>
+        <w:numPr>
+          <w:ilvl w:val="0"/>
+          <w:numId w:val="2"/>
+        </w:numPr>
+      </w:pPr>
+      <w:r>
+        <w:t xml:space="preserve">IT </w:t>
+      </w:r>
+      <w:proofErr w:type="spellStart"/>
+      <w:r>
+        <w:t>Support</w:t>
+      </w:r>
+      <w:proofErr w:type="spellEnd"/>
+      <w:r>
+        <w:t xml:space="preserve"> &amp; Service </w:t>
+      </w:r>
+    </w:p>
+    <w:p>
+      <w:pPr>
+        <w:pStyle w:val="DaftarParagraf"/>
+        <w:numPr>
+          <w:ilvl w:val="0"/>
+          <w:numId w:val="2"/>
+        </w:numPr>
+      </w:pPr>
+      <w:proofErr w:type="spellStart"/>
+      <w:r>
+        <w:t>Technopreneur</w:t>
+      </w:r>
+      <w:proofErr w:type="spellEnd"/>
+      <w:r>
+        <w:t xml:space="preserve"> </w:t>
+      </w:r>
+    </w:p>
+    <w:p>
+      <w:pPr>
+        <w:pStyle w:val="DaftarParagraf"/>
+        <w:numPr>
+          <w:ilvl w:val="0"/>
+          <w:numId w:val="2"/>
+        </w:numPr>
+      </w:pPr>
+      <w:r>
+        <w:t xml:space="preserve">Project </w:t>
+      </w:r>
+      <w:proofErr w:type="spellStart"/>
+      <w:r>
+        <w:t>Manager</w:t>
+      </w:r>
+      <w:proofErr w:type="spellEnd"/>
+      <w:r>
+        <w:t xml:space="preserve"> </w:t>
+      </w:r>
+    </w:p>
+    <w:p>
+      <w:pPr>
+        <w:pStyle w:val="DaftarParagraf"/>
+        <w:numPr>
+          <w:ilvl w:val="0"/>
+          <w:numId w:val="2"/>
+        </w:numPr>
+      </w:pPr>
+      <w:proofErr w:type="spellStart"/>
+      <w:r>
+        <w:t>Information</w:t>
+      </w:r>
+      <w:proofErr w:type="spellEnd"/>
+      <w:r>
+        <w:t xml:space="preserve"> Center </w:t>
+      </w:r>
+      <w:proofErr w:type="spellStart"/>
+      <w:r>
+        <w:t>Manager</w:t>
+      </w:r>
+      <w:proofErr w:type="spellEnd"/>
+      <w:r>
+        <w:t xml:space="preserve"> </w:t>
+      </w:r>
+    </w:p>
+    <w:p>
+      <w:pPr>
+        <w:pStyle w:val="DaftarParagraf"/>
+        <w:numPr>
+          <w:ilvl w:val="0"/>
+          <w:numId w:val="2"/>
+        </w:numPr>
+      </w:pPr>
+      <w:proofErr w:type="spellStart"/>
+      <w:r>
+        <w:t>Information</w:t>
+      </w:r>
+      <w:proofErr w:type="spellEnd"/>
+      <w:r>
+        <w:t xml:space="preserve"> Technology </w:t>
+      </w:r>
+      <w:proofErr w:type="spellStart"/>
+      <w:r>
+        <w:t>Government</w:t>
+      </w:r>
+      <w:proofErr w:type="spellEnd"/>
+      <w:r>
+        <w:t xml:space="preserve"> </w:t>
+      </w:r>
+    </w:p>
+    <w:p>
+      <w:pPr>
+        <w:pStyle w:val="DaftarParagraf"/>
+        <w:numPr>
+          <w:ilvl w:val="0"/>
+          <w:numId w:val="2"/>
+        </w:numPr>
+      </w:pPr>
+      <w:r>
+        <w:t xml:space="preserve">Project </w:t>
+      </w:r>
+      <w:proofErr w:type="spellStart"/>
+      <w:r>
+        <w:t>Analyst</w:t>
+      </w:r>
+      <w:proofErr w:type="spellEnd"/>
+      <w:r>
+        <w:t xml:space="preserve"> </w:t>
+      </w:r>
+    </w:p>
+    <w:p>
+      <w:pPr>
+        <w:pStyle w:val="DaftarParagraf"/>
+        <w:numPr>
+          <w:ilvl w:val="0"/>
+          <w:numId w:val="2"/>
+        </w:numPr>
+      </w:pPr>
+      <w:proofErr w:type="spellStart"/>
+      <w:r>
+        <w:t>Research</w:t>
+      </w:r>
+      <w:proofErr w:type="spellEnd"/>
+      <w:r>
+        <w:t xml:space="preserve"> </w:t>
+      </w:r>
+      <w:proofErr w:type="spellStart"/>
+      <w:r>
+        <w:t>Assistants</w:t>
+      </w:r>
+      <w:proofErr w:type="spellEnd"/>
     </w:p>
     <w:p>
       <w:pPr>
         <w:pStyle w:val="Judul1"/>
       </w:pPr>
       <w:r>
-        <w:t xml:space="preserve"> </w:t>
-      </w:r>
-      <w:r>
-        <w:t>Peluang Profesi</w:t>
-      </w:r>
-    </w:p>
-    <w:p>
-      <w:pPr>
-        <w:pStyle w:val="Judul2"/>
-      </w:pPr>
-      <w:r>
-        <w:t xml:space="preserve"> Teknik Informatika</w:t>
-      </w:r>
-    </w:p>
-    <w:p>
-      <w:pPr>
-        <w:pStyle w:val="DaftarParagraf"/>
-        <w:numPr>
-          <w:ilvl w:val="0"/>
-          <w:numId w:val="1"/>
-        </w:numPr>
-      </w:pPr>
-      <w:r>
-        <w:t xml:space="preserve">IT </w:t>
-      </w:r>
-      <w:proofErr w:type="spellStart"/>
-      <w:r>
-        <w:t>Support</w:t>
-      </w:r>
-      <w:proofErr w:type="spellEnd"/>
-      <w:r>
-        <w:t xml:space="preserve"> </w:t>
-      </w:r>
-    </w:p>
-    <w:p>
-      <w:pPr>
-        <w:pStyle w:val="DaftarParagraf"/>
-        <w:numPr>
-          <w:ilvl w:val="0"/>
-          <w:numId w:val="1"/>
-        </w:numPr>
-      </w:pPr>
-      <w:r>
-        <w:t xml:space="preserve">IT </w:t>
-      </w:r>
-      <w:proofErr w:type="spellStart"/>
-      <w:r>
-        <w:t>Manager</w:t>
-      </w:r>
-      <w:proofErr w:type="spellEnd"/>
-      <w:r>
-        <w:t xml:space="preserve"> </w:t>
-      </w:r>
-    </w:p>
-    <w:p>
-      <w:pPr>
-        <w:pStyle w:val="DaftarParagraf"/>
-        <w:numPr>
-          <w:ilvl w:val="0"/>
-          <w:numId w:val="1"/>
-        </w:numPr>
-      </w:pPr>
-      <w:r>
-        <w:t xml:space="preserve">IT </w:t>
-      </w:r>
-      <w:proofErr w:type="spellStart"/>
-      <w:r>
-        <w:t>Consultant</w:t>
-      </w:r>
-      <w:proofErr w:type="spellEnd"/>
-      <w:r>
-        <w:t xml:space="preserve"> </w:t>
-      </w:r>
-    </w:p>
-    <w:p>
-      <w:pPr>
-        <w:pStyle w:val="DaftarParagraf"/>
-        <w:numPr>
-          <w:ilvl w:val="0"/>
-          <w:numId w:val="1"/>
-        </w:numPr>
-      </w:pPr>
-      <w:proofErr w:type="spellStart"/>
-      <w:r>
-        <w:t>Machine</w:t>
-      </w:r>
-      <w:proofErr w:type="spellEnd"/>
-      <w:r>
-        <w:t xml:space="preserve"> </w:t>
-      </w:r>
-      <w:proofErr w:type="spellStart"/>
-      <w:r>
-        <w:t>Learning</w:t>
-      </w:r>
-      <w:proofErr w:type="spellEnd"/>
-      <w:r>
-        <w:t xml:space="preserve"> </w:t>
-      </w:r>
-      <w:proofErr w:type="spellStart"/>
-      <w:r>
-        <w:t>Specialist</w:t>
-      </w:r>
-      <w:proofErr w:type="spellEnd"/>
-      <w:r>
-        <w:t xml:space="preserve"> </w:t>
-      </w:r>
-    </w:p>
-    <w:p>
-      <w:pPr>
-        <w:pStyle w:val="DaftarParagraf"/>
-        <w:numPr>
-          <w:ilvl w:val="0"/>
-          <w:numId w:val="1"/>
-        </w:numPr>
-      </w:pPr>
-      <w:r>
-        <w:t xml:space="preserve">Data </w:t>
-      </w:r>
-      <w:proofErr w:type="spellStart"/>
-      <w:r>
-        <w:t>Science</w:t>
-      </w:r>
-      <w:proofErr w:type="spellEnd"/>
-      <w:r>
-        <w:t xml:space="preserve"> </w:t>
-      </w:r>
-      <w:proofErr w:type="spellStart"/>
-      <w:r>
-        <w:t>Specialist</w:t>
-      </w:r>
-      <w:proofErr w:type="spellEnd"/>
-      <w:r>
-        <w:t xml:space="preserve"> </w:t>
-      </w:r>
-    </w:p>
-    <w:p>
-      <w:pPr>
-        <w:pStyle w:val="DaftarParagraf"/>
-        <w:numPr>
-          <w:ilvl w:val="0"/>
-          <w:numId w:val="1"/>
-        </w:numPr>
-      </w:pPr>
-      <w:proofErr w:type="spellStart"/>
-      <w:r>
-        <w:t>Atificial</w:t>
-      </w:r>
-      <w:proofErr w:type="spellEnd"/>
-      <w:r>
-        <w:t xml:space="preserve"> </w:t>
-      </w:r>
-      <w:proofErr w:type="spellStart"/>
-      <w:r>
-        <w:t>Intelegence</w:t>
-      </w:r>
-      <w:proofErr w:type="spellEnd"/>
-      <w:r>
-        <w:t xml:space="preserve"> </w:t>
-      </w:r>
-      <w:proofErr w:type="spellStart"/>
-      <w:r>
-        <w:t>Specialist</w:t>
-      </w:r>
-      <w:proofErr w:type="spellEnd"/>
-      <w:r>
-        <w:t xml:space="preserve"> </w:t>
-      </w:r>
-    </w:p>
-    <w:p>
-      <w:pPr>
-        <w:pStyle w:val="DaftarParagraf"/>
-        <w:numPr>
-          <w:ilvl w:val="0"/>
-          <w:numId w:val="1"/>
-        </w:numPr>
-      </w:pPr>
-      <w:proofErr w:type="spellStart"/>
-      <w:r>
-        <w:t>Software</w:t>
-      </w:r>
-      <w:proofErr w:type="spellEnd"/>
-      <w:r>
-        <w:t xml:space="preserve"> Developer </w:t>
-      </w:r>
-    </w:p>
-    <w:p>
-      <w:pPr>
-        <w:pStyle w:val="DaftarParagraf"/>
-        <w:numPr>
-          <w:ilvl w:val="0"/>
-          <w:numId w:val="1"/>
-        </w:numPr>
-      </w:pPr>
-      <w:proofErr w:type="spellStart"/>
-      <w:r>
-        <w:t>Database</w:t>
-      </w:r>
-      <w:proofErr w:type="spellEnd"/>
-      <w:r>
-        <w:t xml:space="preserve"> </w:t>
-      </w:r>
-      <w:proofErr w:type="spellStart"/>
-      <w:r>
-        <w:t>Specialist</w:t>
-      </w:r>
-      <w:proofErr w:type="spellEnd"/>
-      <w:r>
-        <w:t xml:space="preserve"> </w:t>
-      </w:r>
-    </w:p>
-    <w:p>
-      <w:pPr>
-        <w:pStyle w:val="DaftarParagraf"/>
-        <w:numPr>
-          <w:ilvl w:val="0"/>
-          <w:numId w:val="1"/>
-        </w:numPr>
-      </w:pPr>
-      <w:r>
-        <w:t xml:space="preserve">System </w:t>
-      </w:r>
-      <w:proofErr w:type="spellStart"/>
-      <w:r>
-        <w:t>Analyst</w:t>
-      </w:r>
-      <w:proofErr w:type="spellEnd"/>
-      <w:r>
-        <w:t xml:space="preserve"> </w:t>
-      </w:r>
-    </w:p>
-    <w:p>
-      <w:pPr>
-        <w:pStyle w:val="DaftarParagraf"/>
-        <w:numPr>
-          <w:ilvl w:val="0"/>
-          <w:numId w:val="1"/>
-        </w:numPr>
-      </w:pPr>
-      <w:r>
-        <w:t xml:space="preserve">Project </w:t>
-      </w:r>
-      <w:proofErr w:type="spellStart"/>
-      <w:r>
-        <w:t>Analyst</w:t>
-      </w:r>
-      <w:proofErr w:type="spellEnd"/>
-      <w:r>
-        <w:t xml:space="preserve"> </w:t>
-      </w:r>
-    </w:p>
-    <w:p>
-      <w:pPr>
-        <w:pStyle w:val="DaftarParagraf"/>
-        <w:numPr>
-          <w:ilvl w:val="0"/>
-          <w:numId w:val="1"/>
-        </w:numPr>
-      </w:pPr>
-      <w:proofErr w:type="spellStart"/>
-      <w:r>
-        <w:t>Technopreneur</w:t>
-      </w:r>
-      <w:proofErr w:type="spellEnd"/>
-      <w:r>
-        <w:t xml:space="preserve"> </w:t>
-      </w:r>
-    </w:p>
-    <w:p>
-      <w:pPr>
-        <w:pStyle w:val="DaftarParagraf"/>
-        <w:numPr>
-          <w:ilvl w:val="0"/>
-          <w:numId w:val="1"/>
-        </w:numPr>
-      </w:pPr>
-      <w:proofErr w:type="spellStart"/>
-      <w:r>
-        <w:t>Database</w:t>
-      </w:r>
-      <w:proofErr w:type="spellEnd"/>
-      <w:r>
-        <w:t xml:space="preserve"> Administrator </w:t>
-      </w:r>
-    </w:p>
-    <w:p>
-      <w:pPr>
-        <w:pStyle w:val="DaftarParagraf"/>
-        <w:numPr>
-          <w:ilvl w:val="0"/>
-          <w:numId w:val="1"/>
-        </w:numPr>
-      </w:pPr>
-      <w:proofErr w:type="spellStart"/>
-      <w:r>
-        <w:t>Computer</w:t>
-      </w:r>
-      <w:proofErr w:type="spellEnd"/>
-      <w:r>
-        <w:t xml:space="preserve"> Network </w:t>
-      </w:r>
-      <w:proofErr w:type="spellStart"/>
-      <w:r>
-        <w:t>Specialist</w:t>
-      </w:r>
-      <w:proofErr w:type="spellEnd"/>
-      <w:r>
-        <w:t xml:space="preserve"> </w:t>
-      </w:r>
-    </w:p>
-    <w:p>
-      <w:pPr>
-        <w:pStyle w:val="DaftarParagraf"/>
-        <w:numPr>
-          <w:ilvl w:val="0"/>
-          <w:numId w:val="1"/>
-        </w:numPr>
-      </w:pPr>
-      <w:proofErr w:type="spellStart"/>
-      <w:r>
-        <w:t>Research</w:t>
-      </w:r>
-      <w:proofErr w:type="spellEnd"/>
-      <w:r>
-        <w:t xml:space="preserve"> </w:t>
-      </w:r>
-      <w:proofErr w:type="spellStart"/>
-      <w:r>
-        <w:t>Assistants</w:t>
-      </w:r>
-      <w:proofErr w:type="spellEnd"/>
-      <w:r>
-        <w:t xml:space="preserve"> </w:t>
-      </w:r>
-    </w:p>
-    <w:p>
-      <w:pPr>
-        <w:pStyle w:val="Judul2"/>
-      </w:pPr>
-      <w:r>
-        <w:t xml:space="preserve">Sistem Informasi </w:t>
-      </w:r>
-    </w:p>
-    <w:p>
-      <w:pPr>
-        <w:pStyle w:val="DaftarParagraf"/>
-        <w:numPr>
-          <w:ilvl w:val="0"/>
-          <w:numId w:val="2"/>
-        </w:numPr>
-      </w:pPr>
-      <w:proofErr w:type="spellStart"/>
-      <w:r>
-        <w:t>Software</w:t>
-      </w:r>
-      <w:proofErr w:type="spellEnd"/>
-      <w:r>
-        <w:t xml:space="preserve"> Developer </w:t>
-      </w:r>
-    </w:p>
-    <w:p>
-      <w:pPr>
-        <w:pStyle w:val="DaftarParagraf"/>
-        <w:numPr>
-          <w:ilvl w:val="0"/>
-          <w:numId w:val="2"/>
-        </w:numPr>
-      </w:pPr>
-      <w:proofErr w:type="spellStart"/>
-      <w:r>
-        <w:t>Database</w:t>
-      </w:r>
-      <w:proofErr w:type="spellEnd"/>
-      <w:r>
-        <w:t xml:space="preserve"> </w:t>
-      </w:r>
-      <w:proofErr w:type="spellStart"/>
-      <w:r>
-        <w:t>Designer</w:t>
-      </w:r>
-      <w:proofErr w:type="spellEnd"/>
-      <w:r>
-        <w:t xml:space="preserve"> </w:t>
-      </w:r>
-    </w:p>
-    <w:p>
-      <w:pPr>
-        <w:pStyle w:val="DaftarParagraf"/>
-        <w:numPr>
-          <w:ilvl w:val="0"/>
-          <w:numId w:val="2"/>
-        </w:numPr>
-      </w:pPr>
-      <w:proofErr w:type="spellStart"/>
-      <w:r>
-        <w:t>Machine</w:t>
-      </w:r>
-      <w:proofErr w:type="spellEnd"/>
-      <w:r>
-        <w:t xml:space="preserve"> </w:t>
-      </w:r>
-      <w:proofErr w:type="spellStart"/>
-      <w:r>
-        <w:t>Learning</w:t>
-      </w:r>
-      <w:proofErr w:type="spellEnd"/>
-      <w:r>
-        <w:t xml:space="preserve"> </w:t>
-      </w:r>
-      <w:proofErr w:type="spellStart"/>
-      <w:r>
-        <w:t>Specialist</w:t>
-      </w:r>
-      <w:proofErr w:type="spellEnd"/>
-      <w:r>
-        <w:t xml:space="preserve"> </w:t>
-      </w:r>
-    </w:p>
-    <w:p>
-      <w:pPr>
-        <w:pStyle w:val="DaftarParagraf"/>
-        <w:numPr>
-          <w:ilvl w:val="0"/>
-          <w:numId w:val="2"/>
-        </w:numPr>
-      </w:pPr>
-      <w:r>
-        <w:t xml:space="preserve">Data </w:t>
-      </w:r>
-      <w:proofErr w:type="spellStart"/>
-      <w:r>
-        <w:t>Science</w:t>
-      </w:r>
-      <w:proofErr w:type="spellEnd"/>
-      <w:r>
-        <w:t xml:space="preserve"> </w:t>
-      </w:r>
-      <w:proofErr w:type="spellStart"/>
-      <w:r>
-        <w:t>Specialist</w:t>
-      </w:r>
-      <w:proofErr w:type="spellEnd"/>
-      <w:r>
-        <w:t xml:space="preserve"> </w:t>
-      </w:r>
-    </w:p>
-    <w:p>
-      <w:pPr>
-        <w:pStyle w:val="DaftarParagraf"/>
-        <w:numPr>
-          <w:ilvl w:val="0"/>
-          <w:numId w:val="2"/>
-        </w:numPr>
-      </w:pPr>
-      <w:proofErr w:type="spellStart"/>
-      <w:r>
-        <w:t>Artificial</w:t>
-      </w:r>
-      <w:proofErr w:type="spellEnd"/>
-      <w:r>
-        <w:t xml:space="preserve"> </w:t>
-      </w:r>
-      <w:proofErr w:type="spellStart"/>
-      <w:r>
-        <w:t>Intelegence</w:t>
-      </w:r>
-      <w:proofErr w:type="spellEnd"/>
-      <w:r>
-        <w:t xml:space="preserve"> </w:t>
-      </w:r>
-      <w:proofErr w:type="spellStart"/>
-      <w:r>
-        <w:t>Specialist</w:t>
-      </w:r>
-      <w:proofErr w:type="spellEnd"/>
-      <w:r>
-        <w:t xml:space="preserve"> </w:t>
-      </w:r>
-    </w:p>
-    <w:p>
-      <w:pPr>
-        <w:pStyle w:val="DaftarParagraf"/>
-        <w:numPr>
-          <w:ilvl w:val="0"/>
-          <w:numId w:val="2"/>
-        </w:numPr>
-      </w:pPr>
-      <w:r>
-        <w:t xml:space="preserve">UI/UX </w:t>
-      </w:r>
-      <w:proofErr w:type="spellStart"/>
-      <w:r>
-        <w:t>Designer</w:t>
-      </w:r>
-      <w:proofErr w:type="spellEnd"/>
-      <w:r>
-        <w:t xml:space="preserve"> </w:t>
-      </w:r>
-    </w:p>
-    <w:p>
-      <w:pPr>
-        <w:pStyle w:val="DaftarParagraf"/>
-        <w:numPr>
-          <w:ilvl w:val="0"/>
-          <w:numId w:val="2"/>
-        </w:numPr>
-      </w:pPr>
-      <w:proofErr w:type="spellStart"/>
-      <w:r>
-        <w:t>Cloud</w:t>
-      </w:r>
-      <w:proofErr w:type="spellEnd"/>
-      <w:r>
-        <w:t xml:space="preserve"> </w:t>
-      </w:r>
-      <w:proofErr w:type="spellStart"/>
-      <w:r>
-        <w:t>Computing</w:t>
-      </w:r>
-      <w:proofErr w:type="spellEnd"/>
-      <w:r>
-        <w:t xml:space="preserve"> </w:t>
-      </w:r>
-    </w:p>
-    <w:p>
-      <w:pPr>
-        <w:pStyle w:val="DaftarParagraf"/>
-        <w:numPr>
-          <w:ilvl w:val="0"/>
-          <w:numId w:val="2"/>
-        </w:numPr>
-      </w:pPr>
-      <w:r>
-        <w:t xml:space="preserve">IT </w:t>
-      </w:r>
-      <w:proofErr w:type="spellStart"/>
-      <w:r>
-        <w:t>Support</w:t>
-      </w:r>
-      <w:proofErr w:type="spellEnd"/>
-      <w:r>
-        <w:t xml:space="preserve"> &amp; Service </w:t>
-      </w:r>
-    </w:p>
-    <w:p>
-      <w:pPr>
-        <w:pStyle w:val="DaftarParagraf"/>
-        <w:numPr>
-          <w:ilvl w:val="0"/>
-          <w:numId w:val="2"/>
-        </w:numPr>
-      </w:pPr>
-      <w:proofErr w:type="spellStart"/>
-      <w:r>
-        <w:t>Technopreneur</w:t>
-      </w:r>
-      <w:proofErr w:type="spellEnd"/>
-      <w:r>
-        <w:t xml:space="preserve"> </w:t>
-      </w:r>
-    </w:p>
-    <w:p>
-      <w:pPr>
-        <w:pStyle w:val="DaftarParagraf"/>
-        <w:numPr>
-          <w:ilvl w:val="0"/>
-          <w:numId w:val="2"/>
-        </w:numPr>
-      </w:pPr>
-      <w:r>
-        <w:t xml:space="preserve">Project </w:t>
-      </w:r>
-      <w:proofErr w:type="spellStart"/>
-      <w:r>
-        <w:t>Manager</w:t>
-      </w:r>
-      <w:proofErr w:type="spellEnd"/>
-      <w:r>
-        <w:t xml:space="preserve"> </w:t>
-      </w:r>
-    </w:p>
-    <w:p>
-      <w:pPr>
-        <w:pStyle w:val="DaftarParagraf"/>
-        <w:numPr>
-          <w:ilvl w:val="0"/>
-          <w:numId w:val="2"/>
-        </w:numPr>
-      </w:pPr>
-      <w:proofErr w:type="spellStart"/>
-      <w:r>
-        <w:t>Information</w:t>
-      </w:r>
-      <w:proofErr w:type="spellEnd"/>
-      <w:r>
-        <w:t xml:space="preserve"> Center </w:t>
-      </w:r>
-      <w:proofErr w:type="spellStart"/>
-      <w:r>
-        <w:t>Manager</w:t>
-      </w:r>
-      <w:proofErr w:type="spellEnd"/>
-      <w:r>
-        <w:t xml:space="preserve"> </w:t>
-      </w:r>
-    </w:p>
-    <w:p>
-      <w:pPr>
-        <w:pStyle w:val="DaftarParagraf"/>
-        <w:numPr>
-          <w:ilvl w:val="0"/>
-          <w:numId w:val="2"/>
-        </w:numPr>
-      </w:pPr>
-      <w:proofErr w:type="spellStart"/>
-      <w:r>
-        <w:t>Information</w:t>
-      </w:r>
-      <w:proofErr w:type="spellEnd"/>
-      <w:r>
-        <w:t xml:space="preserve"> Technology </w:t>
-      </w:r>
-      <w:proofErr w:type="spellStart"/>
-      <w:r>
-        <w:t>Government</w:t>
-      </w:r>
-      <w:proofErr w:type="spellEnd"/>
-      <w:r>
-        <w:t xml:space="preserve"> </w:t>
-      </w:r>
-    </w:p>
-    <w:p>
-      <w:pPr>
-        <w:pStyle w:val="DaftarParagraf"/>
-        <w:numPr>
-          <w:ilvl w:val="0"/>
-          <w:numId w:val="2"/>
-        </w:numPr>
-      </w:pPr>
-      <w:r>
-        <w:lastRenderedPageBreak/>
-        <w:t xml:space="preserve">Project </w:t>
-      </w:r>
-      <w:proofErr w:type="spellStart"/>
-      <w:r>
-        <w:t>Analyst</w:t>
-      </w:r>
-      <w:proofErr w:type="spellEnd"/>
-      <w:r>
-        <w:t xml:space="preserve"> </w:t>
-      </w:r>
-    </w:p>
-    <w:p>
-      <w:pPr>
-        <w:pStyle w:val="DaftarParagraf"/>
-        <w:numPr>
-          <w:ilvl w:val="0"/>
-          <w:numId w:val="2"/>
-        </w:numPr>
-      </w:pPr>
-      <w:proofErr w:type="spellStart"/>
-      <w:r>
-        <w:t>Research</w:t>
-      </w:r>
-      <w:proofErr w:type="spellEnd"/>
-      <w:r>
-        <w:t xml:space="preserve"> </w:t>
-      </w:r>
-      <w:proofErr w:type="spellStart"/>
-      <w:r>
-        <w:t>Assistants</w:t>
-      </w:r>
-      <w:proofErr w:type="spellEnd"/>
-    </w:p>
+        <w:t>Hubungi Kami</w:t>
+      </w:r>
+    </w:p>
+    <w:p>
+      <w:pPr>
+        <w:rPr>
+          <w:b/>
+          <w:bCs/>
+        </w:rPr>
+      </w:pPr>
+      <w:r>
+        <w:rPr>
+          <w:b/>
+          <w:bCs/>
+        </w:rPr>
+        <w:t>Alamat</w:t>
+      </w:r>
+    </w:p>
+    <w:p>
+      <w:r>
+        <w:t xml:space="preserve">Jl. </w:t>
+      </w:r>
+      <w:proofErr w:type="spellStart"/>
+      <w:r>
+        <w:t>Cikutra</w:t>
+      </w:r>
+      <w:proofErr w:type="spellEnd"/>
+      <w:r>
+        <w:t xml:space="preserve"> No.113, Bandung Kota Bandung, Jawa Barat 40124 Indonesia</w:t>
+      </w:r>
+    </w:p>
+    <w:p>
+      <w:proofErr w:type="spellStart"/>
+      <w:r>
+        <w:t>Telp</w:t>
+      </w:r>
+      <w:proofErr w:type="spellEnd"/>
+      <w:r>
+        <w:t>. 022-7207777</w:t>
+      </w:r>
+    </w:p>
+    <w:p>
+      <w:pPr>
+        <w:rPr>
+          <w:b/>
+          <w:bCs/>
+        </w:rPr>
+      </w:pPr>
+      <w:r>
+        <w:rPr>
+          <w:b/>
+          <w:bCs/>
+        </w:rPr>
+        <w:t>E-Mail</w:t>
+      </w:r>
+    </w:p>
+    <w:p>
+      <w:hyperlink r:id="rId5" w:history="1">
+        <w:r>
+          <w:rPr>
+            <w:rStyle w:val="Hyperlink"/>
+          </w:rPr>
+          <w:t>marketing@stmik-bandung.ac.id</w:t>
+        </w:r>
+      </w:hyperlink>
+    </w:p>
+    <w:p>
+      <w:pPr>
+        <w:rPr>
+          <w:b/>
+          <w:bCs/>
+        </w:rPr>
+      </w:pPr>
+      <w:r>
+        <w:rPr>
+          <w:b/>
+          <w:bCs/>
+        </w:rPr>
+        <w:t xml:space="preserve">Telepon / </w:t>
+      </w:r>
+      <w:proofErr w:type="spellStart"/>
+      <w:r>
+        <w:rPr>
+          <w:b/>
+          <w:bCs/>
+        </w:rPr>
+        <w:t>WhatsApp</w:t>
+      </w:r>
+      <w:proofErr w:type="spellEnd"/>
+    </w:p>
+    <w:p>
+      <w:hyperlink r:id="rId6" w:tgtFrame="_blank" w:history="1">
+        <w:r>
+          <w:rPr>
+            <w:rStyle w:val="Hyperlink"/>
+          </w:rPr>
+          <w:t>0811-2342-113</w:t>
+        </w:r>
+      </w:hyperlink>
+    </w:p>
+    <w:p/>
+    <w:p/>
     <w:sectPr>
       <w:pgSz w:w="11906" w:h="16838"/>
       <w:pgMar w:top="1440" w:right="1440" w:bottom="1440" w:left="1440" w:header="720" w:footer="720" w:gutter="0"/>
@@ -1596,7 +1808,6 @@
   <w:style w:type="character" w:default="1" w:styleId="FontParagrafDefault">
     <w:name w:val="Default Paragraph Font"/>
     <w:uiPriority w:val="1"/>
-    <w:semiHidden/>
     <w:unhideWhenUsed/>
   </w:style>
   <w:style w:type="table" w:default="1" w:styleId="TabelNormal">
@@ -1907,6 +2118,29 @@
       <w:smallCaps/>
       <w:color w:val="0F4761" w:themeColor="accent1" w:themeShade="BF"/>
       <w:spacing w:val="5"/>
+    </w:rPr>
+  </w:style>
+  <w:style w:type="character" w:styleId="Hyperlink">
+    <w:name w:val="Hyperlink"/>
+    <w:basedOn w:val="FontParagrafDefault"/>
+    <w:uiPriority w:val="99"/>
+    <w:unhideWhenUsed/>
+    <w:rsid w:val="00CD52BB"/>
+    <w:rPr>
+      <w:color w:val="467886" w:themeColor="hyperlink"/>
+      <w:u w:val="single"/>
+    </w:rPr>
+  </w:style>
+  <w:style w:type="character" w:styleId="SebutanYangBelumTerselesaikan">
+    <w:name w:val="Unresolved Mention"/>
+    <w:basedOn w:val="FontParagrafDefault"/>
+    <w:uiPriority w:val="99"/>
+    <w:semiHidden/>
+    <w:unhideWhenUsed/>
+    <w:rsid w:val="00CD52BB"/>
+    <w:rPr>
+      <w:color w:val="605E5C"/>
+      <w:shd w:val="clear" w:color="auto" w:fill="E1DFDD"/>
     </w:rPr>
   </w:style>
 </w:styles>

</xml_diff>

<commit_message>
fix chat-messages double user_id guest_id when auth
</commit_message>
<xml_diff>
--- a/data/biaya dan tentang kami.docx
+++ b/data/biaya dan tentang kami.docx
@@ -44,8 +44,16 @@
     </w:p>
     <w:p>
       <w:r>
-        <w:t xml:space="preserve">Uang Kuliah Tetap (UKT) Rp. 5,000,000,- Biaya per semester yang mendukung proses pembelajaran, layanan akademik, dan berbagai fasilitas penunjang pendidikan selama masa studi. Untuk memberikan kemudahan pembayaran, UKT dapat dicicil hingga 3 kali, dengan skema 40% saat pengisian KRS, 40% menjelang UTS, dan 20% menjelang UAS. Pengembangan Institusi </w:t>
-      </w:r>
+        <w:t>Langkah awal untuk bergabung menjadi bagian dari keluarga besar STMIK Bandung dan memulai perjalanan menuju masa depan yang lebih cerah.</w:t>
+      </w:r>
+    </w:p>
+    <w:p>
+      <w:pPr>
+        <w:rPr>
+          <w:b/>
+          <w:bCs/>
+        </w:rPr>
+      </w:pPr>
     </w:p>
     <w:p>
       <w:pPr>
@@ -146,13 +154,8 @@
     </w:p>
     <w:p>
       <w:r>
-        <w:t xml:space="preserve">PT. BANK MANDIRI (PERSERO), TBK 1310001988415 a/n STMIK </w:t>
-      </w:r>
-      <w:proofErr w:type="spellStart"/>
-      <w:r>
-        <w:t>bandung</w:t>
-      </w:r>
-      <w:proofErr w:type="spellEnd"/>
+        <w:t>PT. BANK MANDIRI (PERSERO), TBK 1310001988415 a/n STMIK bandung</w:t>
+      </w:r>
     </w:p>
     <w:p/>
     <w:p>
@@ -172,15 +175,7 @@
     </w:p>
     <w:p>
       <w:r>
-        <w:t xml:space="preserve">STMIK Bandung merupakan STMIK pertama di Jawa Barat dan pelopor pendidikan tinggi informatika swasta dengan fokus untuk mencetak tenaga profesional dan </w:t>
-      </w:r>
-      <w:proofErr w:type="spellStart"/>
-      <w:r>
-        <w:t>technopreneur</w:t>
-      </w:r>
-      <w:proofErr w:type="spellEnd"/>
-      <w:r>
-        <w:t xml:space="preserve"> IT. </w:t>
+        <w:t xml:space="preserve">STMIK Bandung merupakan STMIK pertama di Jawa Barat dan pelopor pendidikan tinggi informatika swasta dengan fokus untuk mencetak tenaga profesional dan technopreneur IT. </w:t>
       </w:r>
     </w:p>
     <w:p/>
@@ -197,15 +192,7 @@
     </w:p>
     <w:p>
       <w:r>
-        <w:t xml:space="preserve">Lulusan Program Studi Teknik Informatika STMIK Bandung adalah generasi muda yang memiliki kecakapan dalam Rekayasa Perangkat Lunak, Implementasi Jaringan, dan </w:t>
-      </w:r>
-      <w:proofErr w:type="spellStart"/>
-      <w:r>
-        <w:t>Robotik</w:t>
-      </w:r>
-      <w:proofErr w:type="spellEnd"/>
-      <w:r>
-        <w:t xml:space="preserve"> &amp; Multimedia, sehingga mampu dalam merancang &amp; mengimplementasikan solusi teknologi informasi yang terintegrasi. </w:t>
+        <w:t xml:space="preserve">Lulusan Program Studi Teknik Informatika STMIK Bandung adalah generasi muda yang memiliki kecakapan dalam Rekayasa Perangkat Lunak, Implementasi Jaringan, dan Robotik &amp; Multimedia, sehingga mampu dalam merancang &amp; mengimplementasikan solusi teknologi informasi yang terintegrasi. </w:t>
       </w:r>
     </w:p>
     <w:p/>
@@ -250,15 +237,7 @@
         </w:numPr>
       </w:pPr>
       <w:r>
-        <w:t xml:space="preserve">IT </w:t>
-      </w:r>
-      <w:proofErr w:type="spellStart"/>
-      <w:r>
-        <w:t>Support</w:t>
-      </w:r>
-      <w:proofErr w:type="spellEnd"/>
-      <w:r>
-        <w:t xml:space="preserve"> </w:t>
+        <w:t xml:space="preserve">IT Support </w:t>
       </w:r>
     </w:p>
     <w:p>
@@ -270,15 +249,7 @@
         </w:numPr>
       </w:pPr>
       <w:r>
-        <w:t xml:space="preserve">IT </w:t>
-      </w:r>
-      <w:proofErr w:type="spellStart"/>
-      <w:r>
-        <w:t>Manager</w:t>
-      </w:r>
-      <w:proofErr w:type="spellEnd"/>
-      <w:r>
-        <w:t xml:space="preserve"> </w:t>
+        <w:t xml:space="preserve">IT Manager </w:t>
       </w:r>
     </w:p>
     <w:p>
@@ -290,15 +261,7 @@
         </w:numPr>
       </w:pPr>
       <w:r>
-        <w:t xml:space="preserve">IT </w:t>
-      </w:r>
-      <w:proofErr w:type="spellStart"/>
-      <w:r>
-        <w:t>Consultant</w:t>
-      </w:r>
-      <w:proofErr w:type="spellEnd"/>
-      <w:r>
-        <w:t xml:space="preserve"> </w:t>
+        <w:t xml:space="preserve">IT Consultant </w:t>
       </w:r>
     </w:p>
     <w:p>
@@ -309,29 +272,8 @@
           <w:numId w:val="1"/>
         </w:numPr>
       </w:pPr>
-      <w:proofErr w:type="spellStart"/>
-      <w:r>
-        <w:t>Machine</w:t>
-      </w:r>
-      <w:proofErr w:type="spellEnd"/>
-      <w:r>
-        <w:t xml:space="preserve"> </w:t>
-      </w:r>
-      <w:proofErr w:type="spellStart"/>
-      <w:r>
-        <w:t>Learning</w:t>
-      </w:r>
-      <w:proofErr w:type="spellEnd"/>
-      <w:r>
-        <w:t xml:space="preserve"> </w:t>
-      </w:r>
-      <w:proofErr w:type="spellStart"/>
-      <w:r>
-        <w:t>Specialist</w:t>
-      </w:r>
-      <w:proofErr w:type="spellEnd"/>
-      <w:r>
-        <w:t xml:space="preserve"> </w:t>
+      <w:r>
+        <w:t xml:space="preserve">Machine Learning Specialist </w:t>
       </w:r>
     </w:p>
     <w:p>
@@ -343,23 +285,7 @@
         </w:numPr>
       </w:pPr>
       <w:r>
-        <w:t xml:space="preserve">Data </w:t>
-      </w:r>
-      <w:proofErr w:type="spellStart"/>
-      <w:r>
-        <w:t>Science</w:t>
-      </w:r>
-      <w:proofErr w:type="spellEnd"/>
-      <w:r>
-        <w:t xml:space="preserve"> </w:t>
-      </w:r>
-      <w:proofErr w:type="spellStart"/>
-      <w:r>
-        <w:t>Specialist</w:t>
-      </w:r>
-      <w:proofErr w:type="spellEnd"/>
-      <w:r>
-        <w:t xml:space="preserve"> </w:t>
+        <w:t xml:space="preserve">Data Science Specialist </w:t>
       </w:r>
     </w:p>
     <w:p>
@@ -370,29 +296,8 @@
           <w:numId w:val="1"/>
         </w:numPr>
       </w:pPr>
-      <w:proofErr w:type="spellStart"/>
-      <w:r>
-        <w:t>Atificial</w:t>
-      </w:r>
-      <w:proofErr w:type="spellEnd"/>
-      <w:r>
-        <w:t xml:space="preserve"> </w:t>
-      </w:r>
-      <w:proofErr w:type="spellStart"/>
-      <w:r>
-        <w:t>Intelegence</w:t>
-      </w:r>
-      <w:proofErr w:type="spellEnd"/>
-      <w:r>
-        <w:t xml:space="preserve"> </w:t>
-      </w:r>
-      <w:proofErr w:type="spellStart"/>
-      <w:r>
-        <w:t>Specialist</w:t>
-      </w:r>
-      <w:proofErr w:type="spellEnd"/>
-      <w:r>
-        <w:t xml:space="preserve"> </w:t>
+      <w:r>
+        <w:t xml:space="preserve">Atificial Intelegence Specialist </w:t>
       </w:r>
     </w:p>
     <w:p>
@@ -403,13 +308,8 @@
           <w:numId w:val="1"/>
         </w:numPr>
       </w:pPr>
-      <w:proofErr w:type="spellStart"/>
-      <w:r>
-        <w:t>Software</w:t>
-      </w:r>
-      <w:proofErr w:type="spellEnd"/>
-      <w:r>
-        <w:t xml:space="preserve"> Developer </w:t>
+      <w:r>
+        <w:t xml:space="preserve">Software Developer </w:t>
       </w:r>
     </w:p>
     <w:p>
@@ -420,21 +320,8 @@
           <w:numId w:val="1"/>
         </w:numPr>
       </w:pPr>
-      <w:proofErr w:type="spellStart"/>
-      <w:r>
-        <w:t>Database</w:t>
-      </w:r>
-      <w:proofErr w:type="spellEnd"/>
-      <w:r>
-        <w:t xml:space="preserve"> </w:t>
-      </w:r>
-      <w:proofErr w:type="spellStart"/>
-      <w:r>
-        <w:t>Specialist</w:t>
-      </w:r>
-      <w:proofErr w:type="spellEnd"/>
-      <w:r>
-        <w:t xml:space="preserve"> </w:t>
+      <w:r>
+        <w:t xml:space="preserve">Database Specialist </w:t>
       </w:r>
     </w:p>
     <w:p>
@@ -446,15 +333,7 @@
         </w:numPr>
       </w:pPr>
       <w:r>
-        <w:t xml:space="preserve">System </w:t>
-      </w:r>
-      <w:proofErr w:type="spellStart"/>
-      <w:r>
-        <w:t>Analyst</w:t>
-      </w:r>
-      <w:proofErr w:type="spellEnd"/>
-      <w:r>
-        <w:t xml:space="preserve"> </w:t>
+        <w:t xml:space="preserve">System Analyst </w:t>
       </w:r>
     </w:p>
     <w:p>
@@ -466,15 +345,7 @@
         </w:numPr>
       </w:pPr>
       <w:r>
-        <w:t xml:space="preserve">Project </w:t>
-      </w:r>
-      <w:proofErr w:type="spellStart"/>
-      <w:r>
-        <w:t>Analyst</w:t>
-      </w:r>
-      <w:proofErr w:type="spellEnd"/>
-      <w:r>
-        <w:t xml:space="preserve"> </w:t>
+        <w:t xml:space="preserve">Project Analyst </w:t>
       </w:r>
     </w:p>
     <w:p>
@@ -485,13 +356,8 @@
           <w:numId w:val="1"/>
         </w:numPr>
       </w:pPr>
-      <w:proofErr w:type="spellStart"/>
-      <w:r>
-        <w:t>Technopreneur</w:t>
-      </w:r>
-      <w:proofErr w:type="spellEnd"/>
-      <w:r>
-        <w:t xml:space="preserve"> </w:t>
+      <w:r>
+        <w:t xml:space="preserve">Technopreneur </w:t>
       </w:r>
     </w:p>
     <w:p>
@@ -502,13 +368,8 @@
           <w:numId w:val="1"/>
         </w:numPr>
       </w:pPr>
-      <w:proofErr w:type="spellStart"/>
-      <w:r>
-        <w:t>Database</w:t>
-      </w:r>
-      <w:proofErr w:type="spellEnd"/>
-      <w:r>
-        <w:t xml:space="preserve"> Administrator </w:t>
+      <w:r>
+        <w:t xml:space="preserve">Database Administrator </w:t>
       </w:r>
     </w:p>
     <w:p>
@@ -519,22 +380,9 @@
           <w:numId w:val="1"/>
         </w:numPr>
       </w:pPr>
-      <w:proofErr w:type="spellStart"/>
       <w:r>
         <w:lastRenderedPageBreak/>
-        <w:t>Computer</w:t>
-      </w:r>
-      <w:proofErr w:type="spellEnd"/>
-      <w:r>
-        <w:t xml:space="preserve"> Network </w:t>
-      </w:r>
-      <w:proofErr w:type="spellStart"/>
-      <w:r>
-        <w:t>Specialist</w:t>
-      </w:r>
-      <w:proofErr w:type="spellEnd"/>
-      <w:r>
-        <w:t xml:space="preserve"> </w:t>
+        <w:t xml:space="preserve">Computer Network Specialist </w:t>
       </w:r>
     </w:p>
     <w:p>
@@ -545,21 +393,8 @@
           <w:numId w:val="1"/>
         </w:numPr>
       </w:pPr>
-      <w:proofErr w:type="spellStart"/>
-      <w:r>
-        <w:t>Research</w:t>
-      </w:r>
-      <w:proofErr w:type="spellEnd"/>
-      <w:r>
-        <w:t xml:space="preserve"> </w:t>
-      </w:r>
-      <w:proofErr w:type="spellStart"/>
-      <w:r>
-        <w:t>Assistants</w:t>
-      </w:r>
-      <w:proofErr w:type="spellEnd"/>
-      <w:r>
-        <w:t xml:space="preserve"> </w:t>
+      <w:r>
+        <w:t xml:space="preserve">Research Assistants </w:t>
       </w:r>
     </w:p>
     <w:p>
@@ -578,13 +413,8 @@
           <w:numId w:val="2"/>
         </w:numPr>
       </w:pPr>
-      <w:proofErr w:type="spellStart"/>
-      <w:r>
-        <w:t>Software</w:t>
-      </w:r>
-      <w:proofErr w:type="spellEnd"/>
-      <w:r>
-        <w:t xml:space="preserve"> Developer </w:t>
+      <w:r>
+        <w:t xml:space="preserve">Software Developer </w:t>
       </w:r>
     </w:p>
     <w:p>
@@ -595,21 +425,8 @@
           <w:numId w:val="2"/>
         </w:numPr>
       </w:pPr>
-      <w:proofErr w:type="spellStart"/>
-      <w:r>
-        <w:t>Database</w:t>
-      </w:r>
-      <w:proofErr w:type="spellEnd"/>
-      <w:r>
-        <w:t xml:space="preserve"> </w:t>
-      </w:r>
-      <w:proofErr w:type="spellStart"/>
-      <w:r>
-        <w:t>Designer</w:t>
-      </w:r>
-      <w:proofErr w:type="spellEnd"/>
-      <w:r>
-        <w:t xml:space="preserve"> </w:t>
+      <w:r>
+        <w:t xml:space="preserve">Database Designer </w:t>
       </w:r>
     </w:p>
     <w:p>
@@ -620,29 +437,8 @@
           <w:numId w:val="2"/>
         </w:numPr>
       </w:pPr>
-      <w:proofErr w:type="spellStart"/>
-      <w:r>
-        <w:t>Machine</w:t>
-      </w:r>
-      <w:proofErr w:type="spellEnd"/>
-      <w:r>
-        <w:t xml:space="preserve"> </w:t>
-      </w:r>
-      <w:proofErr w:type="spellStart"/>
-      <w:r>
-        <w:t>Learning</w:t>
-      </w:r>
-      <w:proofErr w:type="spellEnd"/>
-      <w:r>
-        <w:t xml:space="preserve"> </w:t>
-      </w:r>
-      <w:proofErr w:type="spellStart"/>
-      <w:r>
-        <w:t>Specialist</w:t>
-      </w:r>
-      <w:proofErr w:type="spellEnd"/>
-      <w:r>
-        <w:t xml:space="preserve"> </w:t>
+      <w:r>
+        <w:t xml:space="preserve">Machine Learning Specialist </w:t>
       </w:r>
     </w:p>
     <w:p>
@@ -654,23 +450,7 @@
         </w:numPr>
       </w:pPr>
       <w:r>
-        <w:t xml:space="preserve">Data </w:t>
-      </w:r>
-      <w:proofErr w:type="spellStart"/>
-      <w:r>
-        <w:t>Science</w:t>
-      </w:r>
-      <w:proofErr w:type="spellEnd"/>
-      <w:r>
-        <w:t xml:space="preserve"> </w:t>
-      </w:r>
-      <w:proofErr w:type="spellStart"/>
-      <w:r>
-        <w:t>Specialist</w:t>
-      </w:r>
-      <w:proofErr w:type="spellEnd"/>
-      <w:r>
-        <w:t xml:space="preserve"> </w:t>
+        <w:t xml:space="preserve">Data Science Specialist </w:t>
       </w:r>
     </w:p>
     <w:p>
@@ -681,29 +461,8 @@
           <w:numId w:val="2"/>
         </w:numPr>
       </w:pPr>
-      <w:proofErr w:type="spellStart"/>
-      <w:r>
-        <w:t>Artificial</w:t>
-      </w:r>
-      <w:proofErr w:type="spellEnd"/>
-      <w:r>
-        <w:t xml:space="preserve"> </w:t>
-      </w:r>
-      <w:proofErr w:type="spellStart"/>
-      <w:r>
-        <w:t>Intelegence</w:t>
-      </w:r>
-      <w:proofErr w:type="spellEnd"/>
-      <w:r>
-        <w:t xml:space="preserve"> </w:t>
-      </w:r>
-      <w:proofErr w:type="spellStart"/>
-      <w:r>
-        <w:t>Specialist</w:t>
-      </w:r>
-      <w:proofErr w:type="spellEnd"/>
-      <w:r>
-        <w:t xml:space="preserve"> </w:t>
+      <w:r>
+        <w:t xml:space="preserve">Artificial Intelegence Specialist </w:t>
       </w:r>
     </w:p>
     <w:p>
@@ -715,15 +474,7 @@
         </w:numPr>
       </w:pPr>
       <w:r>
-        <w:t xml:space="preserve">UI/UX </w:t>
-      </w:r>
-      <w:proofErr w:type="spellStart"/>
-      <w:r>
-        <w:t>Designer</w:t>
-      </w:r>
-      <w:proofErr w:type="spellEnd"/>
-      <w:r>
-        <w:t xml:space="preserve"> </w:t>
+        <w:t xml:space="preserve">UI/UX Designer </w:t>
       </w:r>
     </w:p>
     <w:p>
@@ -734,21 +485,8 @@
           <w:numId w:val="2"/>
         </w:numPr>
       </w:pPr>
-      <w:proofErr w:type="spellStart"/>
-      <w:r>
-        <w:t>Cloud</w:t>
-      </w:r>
-      <w:proofErr w:type="spellEnd"/>
-      <w:r>
-        <w:t xml:space="preserve"> </w:t>
-      </w:r>
-      <w:proofErr w:type="spellStart"/>
-      <w:r>
-        <w:t>Computing</w:t>
-      </w:r>
-      <w:proofErr w:type="spellEnd"/>
-      <w:r>
-        <w:t xml:space="preserve"> </w:t>
+      <w:r>
+        <w:t xml:space="preserve">Cloud Computing </w:t>
       </w:r>
     </w:p>
     <w:p>
@@ -760,15 +498,7 @@
         </w:numPr>
       </w:pPr>
       <w:r>
-        <w:t xml:space="preserve">IT </w:t>
-      </w:r>
-      <w:proofErr w:type="spellStart"/>
-      <w:r>
-        <w:t>Support</w:t>
-      </w:r>
-      <w:proofErr w:type="spellEnd"/>
-      <w:r>
-        <w:t xml:space="preserve"> &amp; Service </w:t>
+        <w:t xml:space="preserve">IT Support &amp; Service </w:t>
       </w:r>
     </w:p>
     <w:p>
@@ -779,13 +509,8 @@
           <w:numId w:val="2"/>
         </w:numPr>
       </w:pPr>
-      <w:proofErr w:type="spellStart"/>
-      <w:r>
-        <w:t>Technopreneur</w:t>
-      </w:r>
-      <w:proofErr w:type="spellEnd"/>
-      <w:r>
-        <w:t xml:space="preserve"> </w:t>
+      <w:r>
+        <w:t xml:space="preserve">Technopreneur </w:t>
       </w:r>
     </w:p>
     <w:p>
@@ -797,15 +522,7 @@
         </w:numPr>
       </w:pPr>
       <w:r>
-        <w:t xml:space="preserve">Project </w:t>
-      </w:r>
-      <w:proofErr w:type="spellStart"/>
-      <w:r>
-        <w:t>Manager</w:t>
-      </w:r>
-      <w:proofErr w:type="spellEnd"/>
-      <w:r>
-        <w:t xml:space="preserve"> </w:t>
+        <w:t xml:space="preserve">Project Manager </w:t>
       </w:r>
     </w:p>
     <w:p>
@@ -816,21 +533,8 @@
           <w:numId w:val="2"/>
         </w:numPr>
       </w:pPr>
-      <w:proofErr w:type="spellStart"/>
-      <w:r>
-        <w:t>Information</w:t>
-      </w:r>
-      <w:proofErr w:type="spellEnd"/>
-      <w:r>
-        <w:t xml:space="preserve"> Center </w:t>
-      </w:r>
-      <w:proofErr w:type="spellStart"/>
-      <w:r>
-        <w:t>Manager</w:t>
-      </w:r>
-      <w:proofErr w:type="spellEnd"/>
-      <w:r>
-        <w:t xml:space="preserve"> </w:t>
+      <w:r>
+        <w:t xml:space="preserve">Information Center Manager </w:t>
       </w:r>
     </w:p>
     <w:p>
@@ -841,21 +545,8 @@
           <w:numId w:val="2"/>
         </w:numPr>
       </w:pPr>
-      <w:proofErr w:type="spellStart"/>
-      <w:r>
-        <w:t>Information</w:t>
-      </w:r>
-      <w:proofErr w:type="spellEnd"/>
-      <w:r>
-        <w:t xml:space="preserve"> Technology </w:t>
-      </w:r>
-      <w:proofErr w:type="spellStart"/>
-      <w:r>
-        <w:t>Government</w:t>
-      </w:r>
-      <w:proofErr w:type="spellEnd"/>
-      <w:r>
-        <w:t xml:space="preserve"> </w:t>
+      <w:r>
+        <w:t xml:space="preserve">Information Technology Government </w:t>
       </w:r>
     </w:p>
     <w:p>
@@ -867,15 +558,7 @@
         </w:numPr>
       </w:pPr>
       <w:r>
-        <w:t xml:space="preserve">Project </w:t>
-      </w:r>
-      <w:proofErr w:type="spellStart"/>
-      <w:r>
-        <w:t>Analyst</w:t>
-      </w:r>
-      <w:proofErr w:type="spellEnd"/>
-      <w:r>
-        <w:t xml:space="preserve"> </w:t>
+        <w:t xml:space="preserve">Project Analyst </w:t>
       </w:r>
     </w:p>
     <w:p>
@@ -886,19 +569,9 @@
           <w:numId w:val="2"/>
         </w:numPr>
       </w:pPr>
-      <w:proofErr w:type="spellStart"/>
-      <w:r>
-        <w:t>Research</w:t>
-      </w:r>
-      <w:proofErr w:type="spellEnd"/>
-      <w:r>
-        <w:t xml:space="preserve"> </w:t>
-      </w:r>
-      <w:proofErr w:type="spellStart"/>
-      <w:r>
-        <w:t>Assistants</w:t>
-      </w:r>
-      <w:proofErr w:type="spellEnd"/>
+      <w:r>
+        <w:t>Research Assistants</w:t>
+      </w:r>
     </w:p>
     <w:p>
       <w:pPr>
@@ -906,6 +579,11 @@
       </w:pPr>
       <w:r>
         <w:t>Hubungi Kami</w:t>
+      </w:r>
+    </w:p>
+    <w:p>
+      <w:r>
+        <w:t>Berikut merupakan kontak yang bisa dihubungi:</w:t>
       </w:r>
     </w:p>
     <w:p>
@@ -925,25 +603,12 @@
     </w:p>
     <w:p>
       <w:r>
-        <w:t xml:space="preserve">Jl. </w:t>
-      </w:r>
-      <w:proofErr w:type="spellStart"/>
-      <w:r>
-        <w:t>Cikutra</w:t>
-      </w:r>
-      <w:proofErr w:type="spellEnd"/>
-      <w:r>
-        <w:t xml:space="preserve"> No.113, Bandung Kota Bandung, Jawa Barat 40124 Indonesia</w:t>
-      </w:r>
-    </w:p>
-    <w:p>
-      <w:proofErr w:type="spellStart"/>
-      <w:r>
-        <w:t>Telp</w:t>
-      </w:r>
-      <w:proofErr w:type="spellEnd"/>
-      <w:r>
-        <w:t>. 022-7207777</w:t>
+        <w:t>Jl. Cikutra No.113, Bandung Kota Bandung, Jawa Barat 40124 Indonesia</w:t>
+      </w:r>
+    </w:p>
+    <w:p>
+      <w:r>
+        <w:t>Telp. 022-7207777</w:t>
       </w:r>
     </w:p>
     <w:p>
@@ -983,17 +648,8 @@
           <w:b/>
           <w:bCs/>
         </w:rPr>
-        <w:t xml:space="preserve">Telepon / </w:t>
-      </w:r>
-      <w:proofErr w:type="spellStart"/>
-      <w:r>
-        <w:rPr>
-          <w:b/>
-          <w:bCs/>
-        </w:rPr>
-        <w:t>WhatsApp</w:t>
-      </w:r>
-      <w:proofErr w:type="spellEnd"/>
+        <w:t>Telepon / WhatsApp</w:t>
+      </w:r>
     </w:p>
     <w:p>
       <w:hyperlink r:id="rId6" w:tgtFrame="_blank" w:history="1">

</xml_diff>

<commit_message>
update chat history like to ilke postgres
</commit_message>
<xml_diff>
--- a/data/biaya dan tentang kami.docx
+++ b/data/biaya dan tentang kami.docx
@@ -198,6 +198,14 @@
         <w:pStyle w:val="Judul1"/>
       </w:pPr>
       <w:r>
+        <w:t>Program Studi</w:t>
+      </w:r>
+    </w:p>
+    <w:p>
+      <w:pPr>
+        <w:pStyle w:val="Judul2"/>
+      </w:pPr>
+      <w:r>
         <w:t xml:space="preserve">Teknik </w:t>
       </w:r>
       <w:r>
@@ -220,27 +228,30 @@
     <w:p/>
     <w:p>
       <w:pPr>
+        <w:pStyle w:val="Judul2"/>
+      </w:pPr>
+      <w:r>
+        <w:t>Sistem Informasi</w:t>
+      </w:r>
+    </w:p>
+    <w:p>
+      <w:r>
+        <w:t xml:space="preserve"> Program Studi Sistem Informasi STMIK Bandung memiliki cakupan yang terdiri dari pengetahuan Teknologi Informasi, Sistem Informasi, Bisnis &amp; Manajemen, Teknik dan, Cara Proses data menjadi informasi kemudian menjadi pengetahuan untuk solusi bisnis dan pengambilan keputusan, analisis dan pengembangan aplikasi serta sistem informasi, sehingga menghasilkan lulusan dengan profil analisis dan pengembangan sistem informasi dan teknologi informasi sebagai solusi.</w:t>
+      </w:r>
+    </w:p>
+    <w:p>
+      <w:pPr>
         <w:pStyle w:val="Judul1"/>
       </w:pPr>
       <w:r>
-        <w:t>Sistem Informasi</w:t>
-      </w:r>
-    </w:p>
-    <w:p>
-      <w:r>
-        <w:t xml:space="preserve"> Program Studi Sistem Informasi STMIK Bandung memiliki cakupan yang terdiri dari pengetahuan Teknologi Informasi, Sistem Informasi, Bisnis &amp; Manajemen, Teknik dan, Cara Proses data menjadi informasi kemudian menjadi pengetahuan untuk solusi bisnis dan pengambilan keputusan, analisis dan pengembangan aplikasi serta sistem informasi, sehingga menghasilkan lulusan dengan profil analisis dan pengembangan sistem informasi dan teknologi informasi sebagai solusi.</w:t>
-      </w:r>
-    </w:p>
-    <w:p>
-      <w:pPr>
-        <w:pStyle w:val="Judul1"/>
-      </w:pPr>
-      <w:r>
         <w:t xml:space="preserve"> </w:t>
       </w:r>
       <w:r>
         <w:t>Peluang Profesi</w:t>
       </w:r>
+      <w:r>
+        <w:t xml:space="preserve"> Program Studi</w:t>
+      </w:r>
     </w:p>
     <w:p>
       <w:pPr>
@@ -513,6 +524,7 @@
       </w:pPr>
       <w:proofErr w:type="spellStart"/>
       <w:r>
+        <w:lastRenderedPageBreak/>
         <w:t>Database</w:t>
       </w:r>
       <w:proofErr w:type="spellEnd"/>
@@ -530,7 +542,6 @@
       </w:pPr>
       <w:proofErr w:type="spellStart"/>
       <w:r>
-        <w:lastRenderedPageBreak/>
         <w:t>Computer</w:t>
       </w:r>
       <w:proofErr w:type="spellEnd"/>

</xml_diff>